<commit_message>
Complete Selenium regression reporting and week 9 report
</commit_message>
<xml_diff>
--- a/Selenium_WebDriver/reports/Doctor_Test_Report.docx
+++ b/Selenium_WebDriver/reports/Doctor_Test_Report.docx
@@ -8,8 +8,10 @@
       </w:pPr>
       <w:r>
         <w:rPr>
+          <w:rFonts w:ascii="Times New Roman" w:hAnsi="Times New Roman" w:eastAsia="Times New Roman"/>
           <w:b/>
-          <w:sz w:val="32"/>
+          <w:color w:val="000000"/>
+          <w:sz w:val="26"/>
         </w:rPr>
         <w:t>BÁO CÁO KẾT QUẢ KIỂM THỬ TỰ ĐỘNG</w:t>
         <w:br/>
@@ -21,7 +23,12 @@
         <w:jc w:val="center"/>
       </w:pPr>
       <w:r>
-        <w:t>Thời gian tạo báo cáo: 30/08/2026 19:23:10</w:t>
+        <w:rPr>
+          <w:rFonts w:ascii="Times New Roman" w:hAnsi="Times New Roman" w:eastAsia="Times New Roman"/>
+          <w:color w:val="000000"/>
+          <w:sz w:val="26"/>
+        </w:rPr>
+        <w:t>Thời gian tạo báo cáo: 06/09/2026 19:42:38</w:t>
       </w:r>
     </w:p>
     <w:p/>
@@ -30,6 +37,11 @@
         <w:pStyle w:val="Heading1"/>
       </w:pPr>
       <w:r>
+        <w:rPr>
+          <w:rFonts w:ascii="Times New Roman" w:hAnsi="Times New Roman" w:eastAsia="Times New Roman"/>
+          <w:color w:val="000000"/>
+          <w:sz w:val="26"/>
+        </w:rPr>
         <w:t>1. Tổng quan kết quả</w:t>
       </w:r>
     </w:p>
@@ -50,6 +62,11 @@
           </w:tcPr>
           <w:p>
             <w:r>
+              <w:rPr>
+                <w:rFonts w:ascii="Times New Roman" w:hAnsi="Times New Roman" w:eastAsia="Times New Roman"/>
+                <w:color w:val="000000"/>
+                <w:sz w:val="26"/>
+              </w:rPr>
               <w:t>Nội dung</w:t>
             </w:r>
           </w:p>
@@ -60,6 +77,11 @@
           </w:tcPr>
           <w:p>
             <w:r>
+              <w:rPr>
+                <w:rFonts w:ascii="Times New Roman" w:hAnsi="Times New Roman" w:eastAsia="Times New Roman"/>
+                <w:color w:val="000000"/>
+                <w:sz w:val="26"/>
+              </w:rPr>
               <w:t>Kết quả</w:t>
             </w:r>
           </w:p>
@@ -72,6 +94,11 @@
           </w:tcPr>
           <w:p>
             <w:r>
+              <w:rPr>
+                <w:rFonts w:ascii="Times New Roman" w:hAnsi="Times New Roman" w:eastAsia="Times New Roman"/>
+                <w:color w:val="000000"/>
+                <w:sz w:val="26"/>
+              </w:rPr>
               <w:t>Tổng số Test Case</w:t>
             </w:r>
           </w:p>
@@ -82,6 +109,11 @@
           </w:tcPr>
           <w:p>
             <w:r>
+              <w:rPr>
+                <w:rFonts w:ascii="Times New Roman" w:hAnsi="Times New Roman" w:eastAsia="Times New Roman"/>
+                <w:color w:val="000000"/>
+                <w:sz w:val="26"/>
+              </w:rPr>
               <w:t>4</w:t>
             </w:r>
           </w:p>
@@ -94,6 +126,11 @@
           </w:tcPr>
           <w:p>
             <w:r>
+              <w:rPr>
+                <w:rFonts w:ascii="Times New Roman" w:hAnsi="Times New Roman" w:eastAsia="Times New Roman"/>
+                <w:color w:val="000000"/>
+                <w:sz w:val="26"/>
+              </w:rPr>
               <w:t>Passed</w:t>
             </w:r>
           </w:p>
@@ -104,6 +141,11 @@
           </w:tcPr>
           <w:p>
             <w:r>
+              <w:rPr>
+                <w:rFonts w:ascii="Times New Roman" w:hAnsi="Times New Roman" w:eastAsia="Times New Roman"/>
+                <w:color w:val="000000"/>
+                <w:sz w:val="26"/>
+              </w:rPr>
               <w:t>4</w:t>
             </w:r>
           </w:p>
@@ -116,6 +158,11 @@
           </w:tcPr>
           <w:p>
             <w:r>
+              <w:rPr>
+                <w:rFonts w:ascii="Times New Roman" w:hAnsi="Times New Roman" w:eastAsia="Times New Roman"/>
+                <w:color w:val="000000"/>
+                <w:sz w:val="26"/>
+              </w:rPr>
               <w:t>Failed</w:t>
             </w:r>
           </w:p>
@@ -126,6 +173,11 @@
           </w:tcPr>
           <w:p>
             <w:r>
+              <w:rPr>
+                <w:rFonts w:ascii="Times New Roman" w:hAnsi="Times New Roman" w:eastAsia="Times New Roman"/>
+                <w:color w:val="000000"/>
+                <w:sz w:val="26"/>
+              </w:rPr>
               <w:t>0</w:t>
             </w:r>
           </w:p>
@@ -138,6 +190,11 @@
           </w:tcPr>
           <w:p>
             <w:r>
+              <w:rPr>
+                <w:rFonts w:ascii="Times New Roman" w:hAnsi="Times New Roman" w:eastAsia="Times New Roman"/>
+                <w:color w:val="000000"/>
+                <w:sz w:val="26"/>
+              </w:rPr>
               <w:t>XFailed</w:t>
             </w:r>
           </w:p>
@@ -148,6 +205,11 @@
           </w:tcPr>
           <w:p>
             <w:r>
+              <w:rPr>
+                <w:rFonts w:ascii="Times New Roman" w:hAnsi="Times New Roman" w:eastAsia="Times New Roman"/>
+                <w:color w:val="000000"/>
+                <w:sz w:val="26"/>
+              </w:rPr>
               <w:t>0</w:t>
             </w:r>
           </w:p>
@@ -160,6 +222,11 @@
           </w:tcPr>
           <w:p>
             <w:r>
+              <w:rPr>
+                <w:rFonts w:ascii="Times New Roman" w:hAnsi="Times New Roman" w:eastAsia="Times New Roman"/>
+                <w:color w:val="000000"/>
+                <w:sz w:val="26"/>
+              </w:rPr>
               <w:t>Skipped</w:t>
             </w:r>
           </w:p>
@@ -170,6 +237,11 @@
           </w:tcPr>
           <w:p>
             <w:r>
+              <w:rPr>
+                <w:rFonts w:ascii="Times New Roman" w:hAnsi="Times New Roman" w:eastAsia="Times New Roman"/>
+                <w:color w:val="000000"/>
+                <w:sz w:val="26"/>
+              </w:rPr>
               <w:t>0</w:t>
             </w:r>
           </w:p>
@@ -182,6 +254,11 @@
         <w:pStyle w:val="Heading1"/>
       </w:pPr>
       <w:r>
+        <w:rPr>
+          <w:rFonts w:ascii="Times New Roman" w:hAnsi="Times New Roman" w:eastAsia="Times New Roman"/>
+          <w:color w:val="000000"/>
+          <w:sz w:val="26"/>
+        </w:rPr>
         <w:t>2. Kết quả từng Test Case</w:t>
       </w:r>
     </w:p>
@@ -206,6 +283,11 @@
           </w:tcPr>
           <w:p>
             <w:r>
+              <w:rPr>
+                <w:rFonts w:ascii="Times New Roman" w:hAnsi="Times New Roman" w:eastAsia="Times New Roman"/>
+                <w:color w:val="000000"/>
+                <w:sz w:val="26"/>
+              </w:rPr>
               <w:t>Test Case</w:t>
             </w:r>
           </w:p>
@@ -216,6 +298,11 @@
           </w:tcPr>
           <w:p>
             <w:r>
+              <w:rPr>
+                <w:rFonts w:ascii="Times New Roman" w:hAnsi="Times New Roman" w:eastAsia="Times New Roman"/>
+                <w:color w:val="000000"/>
+                <w:sz w:val="26"/>
+              </w:rPr>
               <w:t>Kết quả</w:t>
             </w:r>
           </w:p>
@@ -226,6 +313,11 @@
           </w:tcPr>
           <w:p>
             <w:r>
+              <w:rPr>
+                <w:rFonts w:ascii="Times New Roman" w:hAnsi="Times New Roman" w:eastAsia="Times New Roman"/>
+                <w:color w:val="000000"/>
+                <w:sz w:val="26"/>
+              </w:rPr>
               <w:t>Thời gian</w:t>
             </w:r>
           </w:p>
@@ -236,6 +328,11 @@
           </w:tcPr>
           <w:p>
             <w:r>
+              <w:rPr>
+                <w:rFonts w:ascii="Times New Roman" w:hAnsi="Times New Roman" w:eastAsia="Times New Roman"/>
+                <w:color w:val="000000"/>
+                <w:sz w:val="26"/>
+              </w:rPr>
               <w:t>Duration (s)</w:t>
             </w:r>
           </w:p>
@@ -246,6 +343,11 @@
           </w:tcPr>
           <w:p>
             <w:r>
+              <w:rPr>
+                <w:rFonts w:ascii="Times New Roman" w:hAnsi="Times New Roman" w:eastAsia="Times New Roman"/>
+                <w:color w:val="000000"/>
+                <w:sz w:val="26"/>
+              </w:rPr>
               <w:t>Screenshot</w:t>
             </w:r>
           </w:p>
@@ -256,6 +358,11 @@
           </w:tcPr>
           <w:p>
             <w:r>
+              <w:rPr>
+                <w:rFonts w:ascii="Times New Roman" w:hAnsi="Times New Roman" w:eastAsia="Times New Roman"/>
+                <w:color w:val="000000"/>
+                <w:sz w:val="26"/>
+              </w:rPr>
               <w:t>Ghi chú</w:t>
             </w:r>
           </w:p>
@@ -268,6 +375,11 @@
           </w:tcPr>
           <w:p>
             <w:r>
+              <w:rPr>
+                <w:rFonts w:ascii="Times New Roman" w:hAnsi="Times New Roman" w:eastAsia="Times New Roman"/>
+                <w:color w:val="000000"/>
+                <w:sz w:val="26"/>
+              </w:rPr>
               <w:t>TC-DOCTOR-001</w:t>
             </w:r>
           </w:p>
@@ -278,6 +390,11 @@
           </w:tcPr>
           <w:p>
             <w:r>
+              <w:rPr>
+                <w:rFonts w:ascii="Times New Roman" w:hAnsi="Times New Roman" w:eastAsia="Times New Roman"/>
+                <w:color w:val="000000"/>
+                <w:sz w:val="26"/>
+              </w:rPr>
               <w:t>PASSED</w:t>
             </w:r>
           </w:p>
@@ -288,7 +405,12 @@
           </w:tcPr>
           <w:p>
             <w:r>
-              <w:t>30/08/2026 19:22:42</w:t>
+              <w:rPr>
+                <w:rFonts w:ascii="Times New Roman" w:hAnsi="Times New Roman" w:eastAsia="Times New Roman"/>
+                <w:color w:val="000000"/>
+                <w:sz w:val="26"/>
+              </w:rPr>
+              <w:t>06/09/2026 19:14:11</w:t>
             </w:r>
           </w:p>
         </w:tc>
@@ -298,7 +420,12 @@
           </w:tcPr>
           <w:p>
             <w:r>
-              <w:t>3.98</w:t>
+              <w:rPr>
+                <w:rFonts w:ascii="Times New Roman" w:hAnsi="Times New Roman" w:eastAsia="Times New Roman"/>
+                <w:color w:val="000000"/>
+                <w:sz w:val="26"/>
+              </w:rPr>
+              <w:t>4.04</w:t>
             </w:r>
           </w:p>
         </w:tc>
@@ -307,7 +434,13 @@
             <w:tcW w:type="dxa" w:w="1440"/>
           </w:tcPr>
           <w:p>
-            <w:r/>
+            <w:r>
+              <w:rPr>
+                <w:rFonts w:ascii="Times New Roman" w:hAnsi="Times New Roman" w:eastAsia="Times New Roman"/>
+                <w:color w:val="000000"/>
+                <w:sz w:val="26"/>
+              </w:rPr>
+            </w:r>
           </w:p>
         </w:tc>
         <w:tc>
@@ -315,7 +448,13 @@
             <w:tcW w:type="dxa" w:w="1440"/>
           </w:tcPr>
           <w:p>
-            <w:r/>
+            <w:r>
+              <w:rPr>
+                <w:rFonts w:ascii="Times New Roman" w:hAnsi="Times New Roman" w:eastAsia="Times New Roman"/>
+                <w:color w:val="000000"/>
+                <w:sz w:val="26"/>
+              </w:rPr>
+            </w:r>
           </w:p>
         </w:tc>
       </w:tr>
@@ -326,6 +465,11 @@
           </w:tcPr>
           <w:p>
             <w:r>
+              <w:rPr>
+                <w:rFonts w:ascii="Times New Roman" w:hAnsi="Times New Roman" w:eastAsia="Times New Roman"/>
+                <w:color w:val="000000"/>
+                <w:sz w:val="26"/>
+              </w:rPr>
               <w:t>TC-DOCTOR-002</w:t>
             </w:r>
           </w:p>
@@ -336,6 +480,11 @@
           </w:tcPr>
           <w:p>
             <w:r>
+              <w:rPr>
+                <w:rFonts w:ascii="Times New Roman" w:hAnsi="Times New Roman" w:eastAsia="Times New Roman"/>
+                <w:color w:val="000000"/>
+                <w:sz w:val="26"/>
+              </w:rPr>
               <w:t>PASSED</w:t>
             </w:r>
           </w:p>
@@ -346,7 +495,12 @@
           </w:tcPr>
           <w:p>
             <w:r>
-              <w:t>30/08/2026 19:22:50</w:t>
+              <w:rPr>
+                <w:rFonts w:ascii="Times New Roman" w:hAnsi="Times New Roman" w:eastAsia="Times New Roman"/>
+                <w:color w:val="000000"/>
+                <w:sz w:val="26"/>
+              </w:rPr>
+              <w:t>06/09/2026 19:14:19</w:t>
             </w:r>
           </w:p>
         </w:tc>
@@ -356,7 +510,12 @@
           </w:tcPr>
           <w:p>
             <w:r>
-              <w:t>4.54</w:t>
+              <w:rPr>
+                <w:rFonts w:ascii="Times New Roman" w:hAnsi="Times New Roman" w:eastAsia="Times New Roman"/>
+                <w:color w:val="000000"/>
+                <w:sz w:val="26"/>
+              </w:rPr>
+              <w:t>4.56</w:t>
             </w:r>
           </w:p>
         </w:tc>
@@ -365,7 +524,13 @@
             <w:tcW w:type="dxa" w:w="1440"/>
           </w:tcPr>
           <w:p>
-            <w:r/>
+            <w:r>
+              <w:rPr>
+                <w:rFonts w:ascii="Times New Roman" w:hAnsi="Times New Roman" w:eastAsia="Times New Roman"/>
+                <w:color w:val="000000"/>
+                <w:sz w:val="26"/>
+              </w:rPr>
+            </w:r>
           </w:p>
         </w:tc>
         <w:tc>
@@ -373,7 +538,13 @@
             <w:tcW w:type="dxa" w:w="1440"/>
           </w:tcPr>
           <w:p>
-            <w:r/>
+            <w:r>
+              <w:rPr>
+                <w:rFonts w:ascii="Times New Roman" w:hAnsi="Times New Roman" w:eastAsia="Times New Roman"/>
+                <w:color w:val="000000"/>
+                <w:sz w:val="26"/>
+              </w:rPr>
+            </w:r>
           </w:p>
         </w:tc>
       </w:tr>
@@ -384,6 +555,11 @@
           </w:tcPr>
           <w:p>
             <w:r>
+              <w:rPr>
+                <w:rFonts w:ascii="Times New Roman" w:hAnsi="Times New Roman" w:eastAsia="Times New Roman"/>
+                <w:color w:val="000000"/>
+                <w:sz w:val="26"/>
+              </w:rPr>
               <w:t>TC-DOCTOR-003</w:t>
             </w:r>
           </w:p>
@@ -394,6 +570,11 @@
           </w:tcPr>
           <w:p>
             <w:r>
+              <w:rPr>
+                <w:rFonts w:ascii="Times New Roman" w:hAnsi="Times New Roman" w:eastAsia="Times New Roman"/>
+                <w:color w:val="000000"/>
+                <w:sz w:val="26"/>
+              </w:rPr>
               <w:t>PASSED</w:t>
             </w:r>
           </w:p>
@@ -404,7 +585,12 @@
           </w:tcPr>
           <w:p>
             <w:r>
-              <w:t>30/08/2026 19:23:01</w:t>
+              <w:rPr>
+                <w:rFonts w:ascii="Times New Roman" w:hAnsi="Times New Roman" w:eastAsia="Times New Roman"/>
+                <w:color w:val="000000"/>
+                <w:sz w:val="26"/>
+              </w:rPr>
+              <w:t>06/09/2026 19:14:29</w:t>
             </w:r>
           </w:p>
         </w:tc>
@@ -414,7 +600,12 @@
           </w:tcPr>
           <w:p>
             <w:r>
-              <w:t>7.56</w:t>
+              <w:rPr>
+                <w:rFonts w:ascii="Times New Roman" w:hAnsi="Times New Roman" w:eastAsia="Times New Roman"/>
+                <w:color w:val="000000"/>
+                <w:sz w:val="26"/>
+              </w:rPr>
+              <w:t>7.50</w:t>
             </w:r>
           </w:p>
         </w:tc>
@@ -423,7 +614,13 @@
             <w:tcW w:type="dxa" w:w="1440"/>
           </w:tcPr>
           <w:p>
-            <w:r/>
+            <w:r>
+              <w:rPr>
+                <w:rFonts w:ascii="Times New Roman" w:hAnsi="Times New Roman" w:eastAsia="Times New Roman"/>
+                <w:color w:val="000000"/>
+                <w:sz w:val="26"/>
+              </w:rPr>
+            </w:r>
           </w:p>
         </w:tc>
         <w:tc>
@@ -431,7 +628,13 @@
             <w:tcW w:type="dxa" w:w="1440"/>
           </w:tcPr>
           <w:p>
-            <w:r/>
+            <w:r>
+              <w:rPr>
+                <w:rFonts w:ascii="Times New Roman" w:hAnsi="Times New Roman" w:eastAsia="Times New Roman"/>
+                <w:color w:val="000000"/>
+                <w:sz w:val="26"/>
+              </w:rPr>
+            </w:r>
           </w:p>
         </w:tc>
       </w:tr>
@@ -442,6 +645,11 @@
           </w:tcPr>
           <w:p>
             <w:r>
+              <w:rPr>
+                <w:rFonts w:ascii="Times New Roman" w:hAnsi="Times New Roman" w:eastAsia="Times New Roman"/>
+                <w:color w:val="000000"/>
+                <w:sz w:val="26"/>
+              </w:rPr>
               <w:t>TC-DOCTOR-004</w:t>
             </w:r>
           </w:p>
@@ -452,6 +660,11 @@
           </w:tcPr>
           <w:p>
             <w:r>
+              <w:rPr>
+                <w:rFonts w:ascii="Times New Roman" w:hAnsi="Times New Roman" w:eastAsia="Times New Roman"/>
+                <w:color w:val="000000"/>
+                <w:sz w:val="26"/>
+              </w:rPr>
               <w:t>PASSED</w:t>
             </w:r>
           </w:p>
@@ -462,7 +675,12 @@
           </w:tcPr>
           <w:p>
             <w:r>
-              <w:t>30/08/2026 19:23:08</w:t>
+              <w:rPr>
+                <w:rFonts w:ascii="Times New Roman" w:hAnsi="Times New Roman" w:eastAsia="Times New Roman"/>
+                <w:color w:val="000000"/>
+                <w:sz w:val="26"/>
+              </w:rPr>
+              <w:t>06/09/2026 19:14:36</w:t>
             </w:r>
           </w:p>
         </w:tc>
@@ -472,6 +690,11 @@
           </w:tcPr>
           <w:p>
             <w:r>
+              <w:rPr>
+                <w:rFonts w:ascii="Times New Roman" w:hAnsi="Times New Roman" w:eastAsia="Times New Roman"/>
+                <w:color w:val="000000"/>
+                <w:sz w:val="26"/>
+              </w:rPr>
               <w:t>3.93</w:t>
             </w:r>
           </w:p>
@@ -481,7 +704,13 @@
             <w:tcW w:type="dxa" w:w="1440"/>
           </w:tcPr>
           <w:p>
-            <w:r/>
+            <w:r>
+              <w:rPr>
+                <w:rFonts w:ascii="Times New Roman" w:hAnsi="Times New Roman" w:eastAsia="Times New Roman"/>
+                <w:color w:val="000000"/>
+                <w:sz w:val="26"/>
+              </w:rPr>
+            </w:r>
           </w:p>
         </w:tc>
         <w:tc>
@@ -489,7 +718,13 @@
             <w:tcW w:type="dxa" w:w="1440"/>
           </w:tcPr>
           <w:p>
-            <w:r/>
+            <w:r>
+              <w:rPr>
+                <w:rFonts w:ascii="Times New Roman" w:hAnsi="Times New Roman" w:eastAsia="Times New Roman"/>
+                <w:color w:val="000000"/>
+                <w:sz w:val="26"/>
+              </w:rPr>
+            </w:r>
           </w:p>
         </w:tc>
       </w:tr>
@@ -500,6 +735,11 @@
         <w:pStyle w:val="Heading1"/>
       </w:pPr>
       <w:r>
+        <w:rPr>
+          <w:rFonts w:ascii="Times New Roman" w:hAnsi="Times New Roman" w:eastAsia="Times New Roman"/>
+          <w:color w:val="000000"/>
+          <w:sz w:val="26"/>
+        </w:rPr>
         <w:t>3. Chi tiết thực thi từng Step</w:t>
       </w:r>
     </w:p>
@@ -524,6 +764,11 @@
           </w:tcPr>
           <w:p>
             <w:r>
+              <w:rPr>
+                <w:rFonts w:ascii="Times New Roman" w:hAnsi="Times New Roman" w:eastAsia="Times New Roman"/>
+                <w:color w:val="000000"/>
+                <w:sz w:val="26"/>
+              </w:rPr>
               <w:t>Test Case</w:t>
             </w:r>
           </w:p>
@@ -534,6 +779,11 @@
           </w:tcPr>
           <w:p>
             <w:r>
+              <w:rPr>
+                <w:rFonts w:ascii="Times New Roman" w:hAnsi="Times New Roman" w:eastAsia="Times New Roman"/>
+                <w:color w:val="000000"/>
+                <w:sz w:val="26"/>
+              </w:rPr>
               <w:t>Step</w:t>
             </w:r>
           </w:p>
@@ -544,6 +794,11 @@
           </w:tcPr>
           <w:p>
             <w:r>
+              <w:rPr>
+                <w:rFonts w:ascii="Times New Roman" w:hAnsi="Times New Roman" w:eastAsia="Times New Roman"/>
+                <w:color w:val="000000"/>
+                <w:sz w:val="26"/>
+              </w:rPr>
               <w:t>Kết quả</w:t>
             </w:r>
           </w:p>
@@ -554,6 +809,11 @@
           </w:tcPr>
           <w:p>
             <w:r>
+              <w:rPr>
+                <w:rFonts w:ascii="Times New Roman" w:hAnsi="Times New Roman" w:eastAsia="Times New Roman"/>
+                <w:color w:val="000000"/>
+                <w:sz w:val="26"/>
+              </w:rPr>
               <w:t>Thời gian</w:t>
             </w:r>
           </w:p>
@@ -564,6 +824,11 @@
           </w:tcPr>
           <w:p>
             <w:r>
+              <w:rPr>
+                <w:rFonts w:ascii="Times New Roman" w:hAnsi="Times New Roman" w:eastAsia="Times New Roman"/>
+                <w:color w:val="000000"/>
+                <w:sz w:val="26"/>
+              </w:rPr>
               <w:t>Mô tả</w:t>
             </w:r>
           </w:p>
@@ -574,6 +839,11 @@
           </w:tcPr>
           <w:p>
             <w:r>
+              <w:rPr>
+                <w:rFonts w:ascii="Times New Roman" w:hAnsi="Times New Roman" w:eastAsia="Times New Roman"/>
+                <w:color w:val="000000"/>
+                <w:sz w:val="26"/>
+              </w:rPr>
               <w:t>Chi tiết</w:t>
             </w:r>
           </w:p>
@@ -586,6 +856,11 @@
           </w:tcPr>
           <w:p>
             <w:r>
+              <w:rPr>
+                <w:rFonts w:ascii="Times New Roman" w:hAnsi="Times New Roman" w:eastAsia="Times New Roman"/>
+                <w:color w:val="000000"/>
+                <w:sz w:val="26"/>
+              </w:rPr>
               <w:t>TC-DOCTOR-001</w:t>
             </w:r>
           </w:p>
@@ -596,6 +871,11 @@
           </w:tcPr>
           <w:p>
             <w:r>
+              <w:rPr>
+                <w:rFonts w:ascii="Times New Roman" w:hAnsi="Times New Roman" w:eastAsia="Times New Roman"/>
+                <w:color w:val="000000"/>
+                <w:sz w:val="26"/>
+              </w:rPr>
               <w:t>1</w:t>
             </w:r>
           </w:p>
@@ -606,6 +886,11 @@
           </w:tcPr>
           <w:p>
             <w:r>
+              <w:rPr>
+                <w:rFonts w:ascii="Times New Roman" w:hAnsi="Times New Roman" w:eastAsia="Times New Roman"/>
+                <w:color w:val="000000"/>
+                <w:sz w:val="26"/>
+              </w:rPr>
               <w:t>PASS</w:t>
             </w:r>
           </w:p>
@@ -616,7 +901,12 @@
           </w:tcPr>
           <w:p>
             <w:r>
-              <w:t>30/08/2026 19:22:42</w:t>
+              <w:rPr>
+                <w:rFonts w:ascii="Times New Roman" w:hAnsi="Times New Roman" w:eastAsia="Times New Roman"/>
+                <w:color w:val="000000"/>
+                <w:sz w:val="26"/>
+              </w:rPr>
+              <w:t>06/09/2026 19:14:11</w:t>
             </w:r>
           </w:p>
         </w:tc>
@@ -626,6 +916,11 @@
           </w:tcPr>
           <w:p>
             <w:r>
+              <w:rPr>
+                <w:rFonts w:ascii="Times New Roman" w:hAnsi="Times New Roman" w:eastAsia="Times New Roman"/>
+                <w:color w:val="000000"/>
+                <w:sz w:val="26"/>
+              </w:rPr>
               <w:t>Mở trang Bác sĩ thành công</w:t>
             </w:r>
           </w:p>
@@ -635,7 +930,13 @@
             <w:tcW w:type="dxa" w:w="1440"/>
           </w:tcPr>
           <w:p>
-            <w:r/>
+            <w:r>
+              <w:rPr>
+                <w:rFonts w:ascii="Times New Roman" w:hAnsi="Times New Roman" w:eastAsia="Times New Roman"/>
+                <w:color w:val="000000"/>
+                <w:sz w:val="26"/>
+              </w:rPr>
+            </w:r>
           </w:p>
         </w:tc>
       </w:tr>
@@ -646,6 +947,11 @@
           </w:tcPr>
           <w:p>
             <w:r>
+              <w:rPr>
+                <w:rFonts w:ascii="Times New Roman" w:hAnsi="Times New Roman" w:eastAsia="Times New Roman"/>
+                <w:color w:val="000000"/>
+                <w:sz w:val="26"/>
+              </w:rPr>
               <w:t>TC-DOCTOR-001</w:t>
             </w:r>
           </w:p>
@@ -656,6 +962,11 @@
           </w:tcPr>
           <w:p>
             <w:r>
+              <w:rPr>
+                <w:rFonts w:ascii="Times New Roman" w:hAnsi="Times New Roman" w:eastAsia="Times New Roman"/>
+                <w:color w:val="000000"/>
+                <w:sz w:val="26"/>
+              </w:rPr>
               <w:t>2</w:t>
             </w:r>
           </w:p>
@@ -666,6 +977,11 @@
           </w:tcPr>
           <w:p>
             <w:r>
+              <w:rPr>
+                <w:rFonts w:ascii="Times New Roman" w:hAnsi="Times New Roman" w:eastAsia="Times New Roman"/>
+                <w:color w:val="000000"/>
+                <w:sz w:val="26"/>
+              </w:rPr>
               <w:t>PASS</w:t>
             </w:r>
           </w:p>
@@ -676,7 +992,12 @@
           </w:tcPr>
           <w:p>
             <w:r>
-              <w:t>30/08/2026 19:22:42</w:t>
+              <w:rPr>
+                <w:rFonts w:ascii="Times New Roman" w:hAnsi="Times New Roman" w:eastAsia="Times New Roman"/>
+                <w:color w:val="000000"/>
+                <w:sz w:val="26"/>
+              </w:rPr>
+              <w:t>06/09/2026 19:14:11</w:t>
             </w:r>
           </w:p>
         </w:tc>
@@ -686,6 +1007,11 @@
           </w:tcPr>
           <w:p>
             <w:r>
+              <w:rPr>
+                <w:rFonts w:ascii="Times New Roman" w:hAnsi="Times New Roman" w:eastAsia="Times New Roman"/>
+                <w:color w:val="000000"/>
+                <w:sz w:val="26"/>
+              </w:rPr>
               <w:t>Hiển thị đúng tiêu đề và số lượng bác sĩ</w:t>
             </w:r>
           </w:p>
@@ -696,6 +1022,11 @@
           </w:tcPr>
           <w:p>
             <w:r>
+              <w:rPr>
+                <w:rFonts w:ascii="Times New Roman" w:hAnsi="Times New Roman" w:eastAsia="Times New Roman"/>
+                <w:color w:val="000000"/>
+                <w:sz w:val="26"/>
+              </w:rPr>
               <w:t>Số lượng: 4</w:t>
             </w:r>
           </w:p>
@@ -708,6 +1039,11 @@
           </w:tcPr>
           <w:p>
             <w:r>
+              <w:rPr>
+                <w:rFonts w:ascii="Times New Roman" w:hAnsi="Times New Roman" w:eastAsia="Times New Roman"/>
+                <w:color w:val="000000"/>
+                <w:sz w:val="26"/>
+              </w:rPr>
               <w:t>TC-DOCTOR-001</w:t>
             </w:r>
           </w:p>
@@ -718,6 +1054,11 @@
           </w:tcPr>
           <w:p>
             <w:r>
+              <w:rPr>
+                <w:rFonts w:ascii="Times New Roman" w:hAnsi="Times New Roman" w:eastAsia="Times New Roman"/>
+                <w:color w:val="000000"/>
+                <w:sz w:val="26"/>
+              </w:rPr>
               <w:t>3</w:t>
             </w:r>
           </w:p>
@@ -728,6 +1069,11 @@
           </w:tcPr>
           <w:p>
             <w:r>
+              <w:rPr>
+                <w:rFonts w:ascii="Times New Roman" w:hAnsi="Times New Roman" w:eastAsia="Times New Roman"/>
+                <w:color w:val="000000"/>
+                <w:sz w:val="26"/>
+              </w:rPr>
               <w:t>PASS</w:t>
             </w:r>
           </w:p>
@@ -738,7 +1084,12 @@
           </w:tcPr>
           <w:p>
             <w:r>
-              <w:t>30/08/2026 19:22:42</w:t>
+              <w:rPr>
+                <w:rFonts w:ascii="Times New Roman" w:hAnsi="Times New Roman" w:eastAsia="Times New Roman"/>
+                <w:color w:val="000000"/>
+                <w:sz w:val="26"/>
+              </w:rPr>
+              <w:t>06/09/2026 19:14:11</w:t>
             </w:r>
           </w:p>
         </w:tc>
@@ -748,6 +1099,11 @@
           </w:tcPr>
           <w:p>
             <w:r>
+              <w:rPr>
+                <w:rFonts w:ascii="Times New Roman" w:hAnsi="Times New Roman" w:eastAsia="Times New Roman"/>
+                <w:color w:val="000000"/>
+                <w:sz w:val="26"/>
+              </w:rPr>
               <w:t>Danh sách hiển thị đầy đủ 4 card bác sĩ</w:t>
             </w:r>
           </w:p>
@@ -757,7 +1113,13 @@
             <w:tcW w:type="dxa" w:w="1440"/>
           </w:tcPr>
           <w:p>
-            <w:r/>
+            <w:r>
+              <w:rPr>
+                <w:rFonts w:ascii="Times New Roman" w:hAnsi="Times New Roman" w:eastAsia="Times New Roman"/>
+                <w:color w:val="000000"/>
+                <w:sz w:val="26"/>
+              </w:rPr>
+            </w:r>
           </w:p>
         </w:tc>
       </w:tr>
@@ -768,6 +1130,11 @@
           </w:tcPr>
           <w:p>
             <w:r>
+              <w:rPr>
+                <w:rFonts w:ascii="Times New Roman" w:hAnsi="Times New Roman" w:eastAsia="Times New Roman"/>
+                <w:color w:val="000000"/>
+                <w:sz w:val="26"/>
+              </w:rPr>
               <w:t>TC-DOCTOR-001</w:t>
             </w:r>
           </w:p>
@@ -778,6 +1145,11 @@
           </w:tcPr>
           <w:p>
             <w:r>
+              <w:rPr>
+                <w:rFonts w:ascii="Times New Roman" w:hAnsi="Times New Roman" w:eastAsia="Times New Roman"/>
+                <w:color w:val="000000"/>
+                <w:sz w:val="26"/>
+              </w:rPr>
               <w:t>4</w:t>
             </w:r>
           </w:p>
@@ -788,6 +1160,11 @@
           </w:tcPr>
           <w:p>
             <w:r>
+              <w:rPr>
+                <w:rFonts w:ascii="Times New Roman" w:hAnsi="Times New Roman" w:eastAsia="Times New Roman"/>
+                <w:color w:val="000000"/>
+                <w:sz w:val="26"/>
+              </w:rPr>
               <w:t>PASS</w:t>
             </w:r>
           </w:p>
@@ -798,7 +1175,12 @@
           </w:tcPr>
           <w:p>
             <w:r>
-              <w:t>30/08/2026 19:22:42</w:t>
+              <w:rPr>
+                <w:rFonts w:ascii="Times New Roman" w:hAnsi="Times New Roman" w:eastAsia="Times New Roman"/>
+                <w:color w:val="000000"/>
+                <w:sz w:val="26"/>
+              </w:rPr>
+              <w:t>06/09/2026 19:14:11</w:t>
             </w:r>
           </w:p>
         </w:tc>
@@ -808,6 +1190,11 @@
           </w:tcPr>
           <w:p>
             <w:r>
+              <w:rPr>
+                <w:rFonts w:ascii="Times New Roman" w:hAnsi="Times New Roman" w:eastAsia="Times New Roman"/>
+                <w:color w:val="000000"/>
+                <w:sz w:val="26"/>
+              </w:rPr>
               <w:t>Mỗi card hiển thị đầy đủ hình ảnh, tên, chuyên khoa, kinh nghiệm và nút Đặt lịch hẹn</w:t>
             </w:r>
           </w:p>
@@ -818,6 +1205,11 @@
           </w:tcPr>
           <w:p>
             <w:r>
+              <w:rPr>
+                <w:rFonts w:ascii="Times New Roman" w:hAnsi="Times New Roman" w:eastAsia="Times New Roman"/>
+                <w:color w:val="000000"/>
+                <w:sz w:val="26"/>
+              </w:rPr>
               <w:t>Doctors: Vu Thinh, Ly Minh, Pham Dung, Tran Binh</w:t>
             </w:r>
           </w:p>
@@ -830,6 +1222,11 @@
           </w:tcPr>
           <w:p>
             <w:r>
+              <w:rPr>
+                <w:rFonts w:ascii="Times New Roman" w:hAnsi="Times New Roman" w:eastAsia="Times New Roman"/>
+                <w:color w:val="000000"/>
+                <w:sz w:val="26"/>
+              </w:rPr>
               <w:t>TC-DOCTOR-002</w:t>
             </w:r>
           </w:p>
@@ -840,6 +1237,11 @@
           </w:tcPr>
           <w:p>
             <w:r>
+              <w:rPr>
+                <w:rFonts w:ascii="Times New Roman" w:hAnsi="Times New Roman" w:eastAsia="Times New Roman"/>
+                <w:color w:val="000000"/>
+                <w:sz w:val="26"/>
+              </w:rPr>
               <w:t>1</w:t>
             </w:r>
           </w:p>
@@ -850,6 +1252,11 @@
           </w:tcPr>
           <w:p>
             <w:r>
+              <w:rPr>
+                <w:rFonts w:ascii="Times New Roman" w:hAnsi="Times New Roman" w:eastAsia="Times New Roman"/>
+                <w:color w:val="000000"/>
+                <w:sz w:val="26"/>
+              </w:rPr>
               <w:t>PASS</w:t>
             </w:r>
           </w:p>
@@ -860,7 +1267,12 @@
           </w:tcPr>
           <w:p>
             <w:r>
-              <w:t>30/08/2026 19:22:50</w:t>
+              <w:rPr>
+                <w:rFonts w:ascii="Times New Roman" w:hAnsi="Times New Roman" w:eastAsia="Times New Roman"/>
+                <w:color w:val="000000"/>
+                <w:sz w:val="26"/>
+              </w:rPr>
+              <w:t>06/09/2026 19:14:18</w:t>
             </w:r>
           </w:p>
         </w:tc>
@@ -870,6 +1282,11 @@
           </w:tcPr>
           <w:p>
             <w:r>
+              <w:rPr>
+                <w:rFonts w:ascii="Times New Roman" w:hAnsi="Times New Roman" w:eastAsia="Times New Roman"/>
+                <w:color w:val="000000"/>
+                <w:sz w:val="26"/>
+              </w:rPr>
               <w:t>Mở trang Bác sĩ thành công</w:t>
             </w:r>
           </w:p>
@@ -879,7 +1296,13 @@
             <w:tcW w:type="dxa" w:w="1440"/>
           </w:tcPr>
           <w:p>
-            <w:r/>
+            <w:r>
+              <w:rPr>
+                <w:rFonts w:ascii="Times New Roman" w:hAnsi="Times New Roman" w:eastAsia="Times New Roman"/>
+                <w:color w:val="000000"/>
+                <w:sz w:val="26"/>
+              </w:rPr>
+            </w:r>
           </w:p>
         </w:tc>
       </w:tr>
@@ -890,6 +1313,11 @@
           </w:tcPr>
           <w:p>
             <w:r>
+              <w:rPr>
+                <w:rFonts w:ascii="Times New Roman" w:hAnsi="Times New Roman" w:eastAsia="Times New Roman"/>
+                <w:color w:val="000000"/>
+                <w:sz w:val="26"/>
+              </w:rPr>
               <w:t>TC-DOCTOR-002</w:t>
             </w:r>
           </w:p>
@@ -900,6 +1328,11 @@
           </w:tcPr>
           <w:p>
             <w:r>
+              <w:rPr>
+                <w:rFonts w:ascii="Times New Roman" w:hAnsi="Times New Roman" w:eastAsia="Times New Roman"/>
+                <w:color w:val="000000"/>
+                <w:sz w:val="26"/>
+              </w:rPr>
               <w:t>2</w:t>
             </w:r>
           </w:p>
@@ -910,6 +1343,11 @@
           </w:tcPr>
           <w:p>
             <w:r>
+              <w:rPr>
+                <w:rFonts w:ascii="Times New Roman" w:hAnsi="Times New Roman" w:eastAsia="Times New Roman"/>
+                <w:color w:val="000000"/>
+                <w:sz w:val="26"/>
+              </w:rPr>
               <w:t>PASS</w:t>
             </w:r>
           </w:p>
@@ -920,7 +1358,12 @@
           </w:tcPr>
           <w:p>
             <w:r>
-              <w:t>30/08/2026 19:22:50</w:t>
+              <w:rPr>
+                <w:rFonts w:ascii="Times New Roman" w:hAnsi="Times New Roman" w:eastAsia="Times New Roman"/>
+                <w:color w:val="000000"/>
+                <w:sz w:val="26"/>
+              </w:rPr>
+              <w:t>06/09/2026 19:14:18</w:t>
             </w:r>
           </w:p>
         </w:tc>
@@ -930,6 +1373,11 @@
           </w:tcPr>
           <w:p>
             <w:r>
+              <w:rPr>
+                <w:rFonts w:ascii="Times New Roman" w:hAnsi="Times New Roman" w:eastAsia="Times New Roman"/>
+                <w:color w:val="000000"/>
+                <w:sz w:val="26"/>
+              </w:rPr>
               <w:t>Nhập từ khóa tìm kiếm: Tran Binh</w:t>
             </w:r>
           </w:p>
@@ -939,7 +1387,13 @@
             <w:tcW w:type="dxa" w:w="1440"/>
           </w:tcPr>
           <w:p>
-            <w:r/>
+            <w:r>
+              <w:rPr>
+                <w:rFonts w:ascii="Times New Roman" w:hAnsi="Times New Roman" w:eastAsia="Times New Roman"/>
+                <w:color w:val="000000"/>
+                <w:sz w:val="26"/>
+              </w:rPr>
+            </w:r>
           </w:p>
         </w:tc>
       </w:tr>
@@ -950,6 +1404,11 @@
           </w:tcPr>
           <w:p>
             <w:r>
+              <w:rPr>
+                <w:rFonts w:ascii="Times New Roman" w:hAnsi="Times New Roman" w:eastAsia="Times New Roman"/>
+                <w:color w:val="000000"/>
+                <w:sz w:val="26"/>
+              </w:rPr>
               <w:t>TC-DOCTOR-002</w:t>
             </w:r>
           </w:p>
@@ -960,6 +1419,11 @@
           </w:tcPr>
           <w:p>
             <w:r>
+              <w:rPr>
+                <w:rFonts w:ascii="Times New Roman" w:hAnsi="Times New Roman" w:eastAsia="Times New Roman"/>
+                <w:color w:val="000000"/>
+                <w:sz w:val="26"/>
+              </w:rPr>
               <w:t>3</w:t>
             </w:r>
           </w:p>
@@ -970,6 +1434,11 @@
           </w:tcPr>
           <w:p>
             <w:r>
+              <w:rPr>
+                <w:rFonts w:ascii="Times New Roman" w:hAnsi="Times New Roman" w:eastAsia="Times New Roman"/>
+                <w:color w:val="000000"/>
+                <w:sz w:val="26"/>
+              </w:rPr>
               <w:t>PASS</w:t>
             </w:r>
           </w:p>
@@ -980,7 +1449,12 @@
           </w:tcPr>
           <w:p>
             <w:r>
-              <w:t>30/08/2026 19:22:50</w:t>
+              <w:rPr>
+                <w:rFonts w:ascii="Times New Roman" w:hAnsi="Times New Roman" w:eastAsia="Times New Roman"/>
+                <w:color w:val="000000"/>
+                <w:sz w:val="26"/>
+              </w:rPr>
+              <w:t>06/09/2026 19:14:18</w:t>
             </w:r>
           </w:p>
         </w:tc>
@@ -990,6 +1464,11 @@
           </w:tcPr>
           <w:p>
             <w:r>
+              <w:rPr>
+                <w:rFonts w:ascii="Times New Roman" w:hAnsi="Times New Roman" w:eastAsia="Times New Roman"/>
+                <w:color w:val="000000"/>
+                <w:sz w:val="26"/>
+              </w:rPr>
               <w:t>Nhấn nút Tìm kiếm</w:t>
             </w:r>
           </w:p>
@@ -999,7 +1478,13 @@
             <w:tcW w:type="dxa" w:w="1440"/>
           </w:tcPr>
           <w:p>
-            <w:r/>
+            <w:r>
+              <w:rPr>
+                <w:rFonts w:ascii="Times New Roman" w:hAnsi="Times New Roman" w:eastAsia="Times New Roman"/>
+                <w:color w:val="000000"/>
+                <w:sz w:val="26"/>
+              </w:rPr>
+            </w:r>
           </w:p>
         </w:tc>
       </w:tr>
@@ -1010,6 +1495,11 @@
           </w:tcPr>
           <w:p>
             <w:r>
+              <w:rPr>
+                <w:rFonts w:ascii="Times New Roman" w:hAnsi="Times New Roman" w:eastAsia="Times New Roman"/>
+                <w:color w:val="000000"/>
+                <w:sz w:val="26"/>
+              </w:rPr>
               <w:t>TC-DOCTOR-002</w:t>
             </w:r>
           </w:p>
@@ -1020,6 +1510,11 @@
           </w:tcPr>
           <w:p>
             <w:r>
+              <w:rPr>
+                <w:rFonts w:ascii="Times New Roman" w:hAnsi="Times New Roman" w:eastAsia="Times New Roman"/>
+                <w:color w:val="000000"/>
+                <w:sz w:val="26"/>
+              </w:rPr>
               <w:t>4</w:t>
             </w:r>
           </w:p>
@@ -1030,6 +1525,11 @@
           </w:tcPr>
           <w:p>
             <w:r>
+              <w:rPr>
+                <w:rFonts w:ascii="Times New Roman" w:hAnsi="Times New Roman" w:eastAsia="Times New Roman"/>
+                <w:color w:val="000000"/>
+                <w:sz w:val="26"/>
+              </w:rPr>
               <w:t>PASS</w:t>
             </w:r>
           </w:p>
@@ -1040,7 +1540,12 @@
           </w:tcPr>
           <w:p>
             <w:r>
-              <w:t>30/08/2026 19:22:50</w:t>
+              <w:rPr>
+                <w:rFonts w:ascii="Times New Roman" w:hAnsi="Times New Roman" w:eastAsia="Times New Roman"/>
+                <w:color w:val="000000"/>
+                <w:sz w:val="26"/>
+              </w:rPr>
+              <w:t>06/09/2026 19:14:19</w:t>
             </w:r>
           </w:p>
         </w:tc>
@@ -1050,6 +1555,11 @@
           </w:tcPr>
           <w:p>
             <w:r>
+              <w:rPr>
+                <w:rFonts w:ascii="Times New Roman" w:hAnsi="Times New Roman" w:eastAsia="Times New Roman"/>
+                <w:color w:val="000000"/>
+                <w:sz w:val="26"/>
+              </w:rPr>
               <w:t>Tìm thấy đúng bác sĩ Tran Binh và không hiển thị bác sĩ không phù hợp</w:t>
             </w:r>
           </w:p>
@@ -1060,6 +1570,11 @@
           </w:tcPr>
           <w:p>
             <w:r>
+              <w:rPr>
+                <w:rFonts w:ascii="Times New Roman" w:hAnsi="Times New Roman" w:eastAsia="Times New Roman"/>
+                <w:color w:val="000000"/>
+                <w:sz w:val="26"/>
+              </w:rPr>
               <w:t>Actual: ['Tran Binh']</w:t>
             </w:r>
           </w:p>
@@ -1072,6 +1587,11 @@
           </w:tcPr>
           <w:p>
             <w:r>
+              <w:rPr>
+                <w:rFonts w:ascii="Times New Roman" w:hAnsi="Times New Roman" w:eastAsia="Times New Roman"/>
+                <w:color w:val="000000"/>
+                <w:sz w:val="26"/>
+              </w:rPr>
               <w:t>TC-DOCTOR-003</w:t>
             </w:r>
           </w:p>
@@ -1082,6 +1602,11 @@
           </w:tcPr>
           <w:p>
             <w:r>
+              <w:rPr>
+                <w:rFonts w:ascii="Times New Roman" w:hAnsi="Times New Roman" w:eastAsia="Times New Roman"/>
+                <w:color w:val="000000"/>
+                <w:sz w:val="26"/>
+              </w:rPr>
               <w:t>1</w:t>
             </w:r>
           </w:p>
@@ -1092,6 +1617,11 @@
           </w:tcPr>
           <w:p>
             <w:r>
+              <w:rPr>
+                <w:rFonts w:ascii="Times New Roman" w:hAnsi="Times New Roman" w:eastAsia="Times New Roman"/>
+                <w:color w:val="000000"/>
+                <w:sz w:val="26"/>
+              </w:rPr>
               <w:t>PASS</w:t>
             </w:r>
           </w:p>
@@ -1102,7 +1632,12 @@
           </w:tcPr>
           <w:p>
             <w:r>
-              <w:t>30/08/2026 19:22:57</w:t>
+              <w:rPr>
+                <w:rFonts w:ascii="Times New Roman" w:hAnsi="Times New Roman" w:eastAsia="Times New Roman"/>
+                <w:color w:val="000000"/>
+                <w:sz w:val="26"/>
+              </w:rPr>
+              <w:t>06/09/2026 19:14:26</w:t>
             </w:r>
           </w:p>
         </w:tc>
@@ -1112,6 +1647,11 @@
           </w:tcPr>
           <w:p>
             <w:r>
+              <w:rPr>
+                <w:rFonts w:ascii="Times New Roman" w:hAnsi="Times New Roman" w:eastAsia="Times New Roman"/>
+                <w:color w:val="000000"/>
+                <w:sz w:val="26"/>
+              </w:rPr>
               <w:t>Mở trang Bác sĩ thành công</w:t>
             </w:r>
           </w:p>
@@ -1121,7 +1661,13 @@
             <w:tcW w:type="dxa" w:w="1440"/>
           </w:tcPr>
           <w:p>
-            <w:r/>
+            <w:r>
+              <w:rPr>
+                <w:rFonts w:ascii="Times New Roman" w:hAnsi="Times New Roman" w:eastAsia="Times New Roman"/>
+                <w:color w:val="000000"/>
+                <w:sz w:val="26"/>
+              </w:rPr>
+            </w:r>
           </w:p>
         </w:tc>
       </w:tr>
@@ -1132,6 +1678,11 @@
           </w:tcPr>
           <w:p>
             <w:r>
+              <w:rPr>
+                <w:rFonts w:ascii="Times New Roman" w:hAnsi="Times New Roman" w:eastAsia="Times New Roman"/>
+                <w:color w:val="000000"/>
+                <w:sz w:val="26"/>
+              </w:rPr>
               <w:t>TC-DOCTOR-003</w:t>
             </w:r>
           </w:p>
@@ -1142,6 +1693,11 @@
           </w:tcPr>
           <w:p>
             <w:r>
+              <w:rPr>
+                <w:rFonts w:ascii="Times New Roman" w:hAnsi="Times New Roman" w:eastAsia="Times New Roman"/>
+                <w:color w:val="000000"/>
+                <w:sz w:val="26"/>
+              </w:rPr>
               <w:t>2</w:t>
             </w:r>
           </w:p>
@@ -1152,6 +1708,11 @@
           </w:tcPr>
           <w:p>
             <w:r>
+              <w:rPr>
+                <w:rFonts w:ascii="Times New Roman" w:hAnsi="Times New Roman" w:eastAsia="Times New Roman"/>
+                <w:color w:val="000000"/>
+                <w:sz w:val="26"/>
+              </w:rPr>
               <w:t>PASS</w:t>
             </w:r>
           </w:p>
@@ -1162,7 +1723,12 @@
           </w:tcPr>
           <w:p>
             <w:r>
-              <w:t>30/08/2026 19:22:57</w:t>
+              <w:rPr>
+                <w:rFonts w:ascii="Times New Roman" w:hAnsi="Times New Roman" w:eastAsia="Times New Roman"/>
+                <w:color w:val="000000"/>
+                <w:sz w:val="26"/>
+              </w:rPr>
+              <w:t>06/09/2026 19:14:26</w:t>
             </w:r>
           </w:p>
         </w:tc>
@@ -1172,6 +1738,11 @@
           </w:tcPr>
           <w:p>
             <w:r>
+              <w:rPr>
+                <w:rFonts w:ascii="Times New Roman" w:hAnsi="Times New Roman" w:eastAsia="Times New Roman"/>
+                <w:color w:val="000000"/>
+                <w:sz w:val="26"/>
+              </w:rPr>
               <w:t>Nhập tên bác sĩ không tồn tại: Nguyen Van A</w:t>
             </w:r>
           </w:p>
@@ -1181,7 +1752,13 @@
             <w:tcW w:type="dxa" w:w="1440"/>
           </w:tcPr>
           <w:p>
-            <w:r/>
+            <w:r>
+              <w:rPr>
+                <w:rFonts w:ascii="Times New Roman" w:hAnsi="Times New Roman" w:eastAsia="Times New Roman"/>
+                <w:color w:val="000000"/>
+                <w:sz w:val="26"/>
+              </w:rPr>
+            </w:r>
           </w:p>
         </w:tc>
       </w:tr>
@@ -1192,6 +1769,11 @@
           </w:tcPr>
           <w:p>
             <w:r>
+              <w:rPr>
+                <w:rFonts w:ascii="Times New Roman" w:hAnsi="Times New Roman" w:eastAsia="Times New Roman"/>
+                <w:color w:val="000000"/>
+                <w:sz w:val="26"/>
+              </w:rPr>
               <w:t>TC-DOCTOR-003</w:t>
             </w:r>
           </w:p>
@@ -1202,6 +1784,11 @@
           </w:tcPr>
           <w:p>
             <w:r>
+              <w:rPr>
+                <w:rFonts w:ascii="Times New Roman" w:hAnsi="Times New Roman" w:eastAsia="Times New Roman"/>
+                <w:color w:val="000000"/>
+                <w:sz w:val="26"/>
+              </w:rPr>
               <w:t>3</w:t>
             </w:r>
           </w:p>
@@ -1212,6 +1799,11 @@
           </w:tcPr>
           <w:p>
             <w:r>
+              <w:rPr>
+                <w:rFonts w:ascii="Times New Roman" w:hAnsi="Times New Roman" w:eastAsia="Times New Roman"/>
+                <w:color w:val="000000"/>
+                <w:sz w:val="26"/>
+              </w:rPr>
               <w:t>PASS</w:t>
             </w:r>
           </w:p>
@@ -1222,7 +1814,12 @@
           </w:tcPr>
           <w:p>
             <w:r>
-              <w:t>30/08/2026 19:22:58</w:t>
+              <w:rPr>
+                <w:rFonts w:ascii="Times New Roman" w:hAnsi="Times New Roman" w:eastAsia="Times New Roman"/>
+                <w:color w:val="000000"/>
+                <w:sz w:val="26"/>
+              </w:rPr>
+              <w:t>06/09/2026 19:14:26</w:t>
             </w:r>
           </w:p>
         </w:tc>
@@ -1232,6 +1829,11 @@
           </w:tcPr>
           <w:p>
             <w:r>
+              <w:rPr>
+                <w:rFonts w:ascii="Times New Roman" w:hAnsi="Times New Roman" w:eastAsia="Times New Roman"/>
+                <w:color w:val="000000"/>
+                <w:sz w:val="26"/>
+              </w:rPr>
               <w:t>Nhấn nút Tìm kiếm</w:t>
             </w:r>
           </w:p>
@@ -1241,7 +1843,13 @@
             <w:tcW w:type="dxa" w:w="1440"/>
           </w:tcPr>
           <w:p>
-            <w:r/>
+            <w:r>
+              <w:rPr>
+                <w:rFonts w:ascii="Times New Roman" w:hAnsi="Times New Roman" w:eastAsia="Times New Roman"/>
+                <w:color w:val="000000"/>
+                <w:sz w:val="26"/>
+              </w:rPr>
+            </w:r>
           </w:p>
         </w:tc>
       </w:tr>
@@ -1252,6 +1860,11 @@
           </w:tcPr>
           <w:p>
             <w:r>
+              <w:rPr>
+                <w:rFonts w:ascii="Times New Roman" w:hAnsi="Times New Roman" w:eastAsia="Times New Roman"/>
+                <w:color w:val="000000"/>
+                <w:sz w:val="26"/>
+              </w:rPr>
               <w:t>TC-DOCTOR-003</w:t>
             </w:r>
           </w:p>
@@ -1262,6 +1875,11 @@
           </w:tcPr>
           <w:p>
             <w:r>
+              <w:rPr>
+                <w:rFonts w:ascii="Times New Roman" w:hAnsi="Times New Roman" w:eastAsia="Times New Roman"/>
+                <w:color w:val="000000"/>
+                <w:sz w:val="26"/>
+              </w:rPr>
               <w:t>4</w:t>
             </w:r>
           </w:p>
@@ -1272,6 +1890,11 @@
           </w:tcPr>
           <w:p>
             <w:r>
+              <w:rPr>
+                <w:rFonts w:ascii="Times New Roman" w:hAnsi="Times New Roman" w:eastAsia="Times New Roman"/>
+                <w:color w:val="000000"/>
+                <w:sz w:val="26"/>
+              </w:rPr>
               <w:t>PASS</w:t>
             </w:r>
           </w:p>
@@ -1282,7 +1905,12 @@
           </w:tcPr>
           <w:p>
             <w:r>
-              <w:t>30/08/2026 19:23:01</w:t>
+              <w:rPr>
+                <w:rFonts w:ascii="Times New Roman" w:hAnsi="Times New Roman" w:eastAsia="Times New Roman"/>
+                <w:color w:val="000000"/>
+                <w:sz w:val="26"/>
+              </w:rPr>
+              <w:t>06/09/2026 19:14:29</w:t>
             </w:r>
           </w:p>
         </w:tc>
@@ -1292,6 +1920,11 @@
           </w:tcPr>
           <w:p>
             <w:r>
+              <w:rPr>
+                <w:rFonts w:ascii="Times New Roman" w:hAnsi="Times New Roman" w:eastAsia="Times New Roman"/>
+                <w:color w:val="000000"/>
+                <w:sz w:val="26"/>
+              </w:rPr>
               <w:t>Không hiển thị bác sĩ không phù hợp và hiển thị trạng thái không có kết quả</w:t>
             </w:r>
           </w:p>
@@ -1302,6 +1935,11 @@
           </w:tcPr>
           <w:p>
             <w:r>
+              <w:rPr>
+                <w:rFonts w:ascii="Times New Roman" w:hAnsi="Times New Roman" w:eastAsia="Times New Roman"/>
+                <w:color w:val="000000"/>
+                <w:sz w:val="26"/>
+              </w:rPr>
               <w:t>KHÔNG có kết quả phù hợp!</w:t>
             </w:r>
           </w:p>
@@ -1314,6 +1952,11 @@
           </w:tcPr>
           <w:p>
             <w:r>
+              <w:rPr>
+                <w:rFonts w:ascii="Times New Roman" w:hAnsi="Times New Roman" w:eastAsia="Times New Roman"/>
+                <w:color w:val="000000"/>
+                <w:sz w:val="26"/>
+              </w:rPr>
               <w:t>TC-DOCTOR-004</w:t>
             </w:r>
           </w:p>
@@ -1324,6 +1967,11 @@
           </w:tcPr>
           <w:p>
             <w:r>
+              <w:rPr>
+                <w:rFonts w:ascii="Times New Roman" w:hAnsi="Times New Roman" w:eastAsia="Times New Roman"/>
+                <w:color w:val="000000"/>
+                <w:sz w:val="26"/>
+              </w:rPr>
               <w:t>1</w:t>
             </w:r>
           </w:p>
@@ -1334,6 +1982,11 @@
           </w:tcPr>
           <w:p>
             <w:r>
+              <w:rPr>
+                <w:rFonts w:ascii="Times New Roman" w:hAnsi="Times New Roman" w:eastAsia="Times New Roman"/>
+                <w:color w:val="000000"/>
+                <w:sz w:val="26"/>
+              </w:rPr>
               <w:t>PASS</w:t>
             </w:r>
           </w:p>
@@ -1344,7 +1997,12 @@
           </w:tcPr>
           <w:p>
             <w:r>
-              <w:t>30/08/2026 19:23:08</w:t>
+              <w:rPr>
+                <w:rFonts w:ascii="Times New Roman" w:hAnsi="Times New Roman" w:eastAsia="Times New Roman"/>
+                <w:color w:val="000000"/>
+                <w:sz w:val="26"/>
+              </w:rPr>
+              <w:t>06/09/2026 19:14:36</w:t>
             </w:r>
           </w:p>
         </w:tc>
@@ -1354,6 +2012,11 @@
           </w:tcPr>
           <w:p>
             <w:r>
+              <w:rPr>
+                <w:rFonts w:ascii="Times New Roman" w:hAnsi="Times New Roman" w:eastAsia="Times New Roman"/>
+                <w:color w:val="000000"/>
+                <w:sz w:val="26"/>
+              </w:rPr>
               <w:t>Mở trang Bác sĩ thành công</w:t>
             </w:r>
           </w:p>
@@ -1363,7 +2026,13 @@
             <w:tcW w:type="dxa" w:w="1440"/>
           </w:tcPr>
           <w:p>
-            <w:r/>
+            <w:r>
+              <w:rPr>
+                <w:rFonts w:ascii="Times New Roman" w:hAnsi="Times New Roman" w:eastAsia="Times New Roman"/>
+                <w:color w:val="000000"/>
+                <w:sz w:val="26"/>
+              </w:rPr>
+            </w:r>
           </w:p>
         </w:tc>
       </w:tr>
@@ -1374,6 +2043,11 @@
           </w:tcPr>
           <w:p>
             <w:r>
+              <w:rPr>
+                <w:rFonts w:ascii="Times New Roman" w:hAnsi="Times New Roman" w:eastAsia="Times New Roman"/>
+                <w:color w:val="000000"/>
+                <w:sz w:val="26"/>
+              </w:rPr>
               <w:t>TC-DOCTOR-004</w:t>
             </w:r>
           </w:p>
@@ -1384,6 +2058,11 @@
           </w:tcPr>
           <w:p>
             <w:r>
+              <w:rPr>
+                <w:rFonts w:ascii="Times New Roman" w:hAnsi="Times New Roman" w:eastAsia="Times New Roman"/>
+                <w:color w:val="000000"/>
+                <w:sz w:val="26"/>
+              </w:rPr>
               <w:t>2</w:t>
             </w:r>
           </w:p>
@@ -1394,6 +2073,11 @@
           </w:tcPr>
           <w:p>
             <w:r>
+              <w:rPr>
+                <w:rFonts w:ascii="Times New Roman" w:hAnsi="Times New Roman" w:eastAsia="Times New Roman"/>
+                <w:color w:val="000000"/>
+                <w:sz w:val="26"/>
+              </w:rPr>
               <w:t>PASS</w:t>
             </w:r>
           </w:p>
@@ -1404,7 +2088,12 @@
           </w:tcPr>
           <w:p>
             <w:r>
-              <w:t>30/08/2026 19:23:08</w:t>
+              <w:rPr>
+                <w:rFonts w:ascii="Times New Roman" w:hAnsi="Times New Roman" w:eastAsia="Times New Roman"/>
+                <w:color w:val="000000"/>
+                <w:sz w:val="26"/>
+              </w:rPr>
+              <w:t>06/09/2026 19:14:36</w:t>
             </w:r>
           </w:p>
         </w:tc>
@@ -1414,6 +2103,11 @@
           </w:tcPr>
           <w:p>
             <w:r>
+              <w:rPr>
+                <w:rFonts w:ascii="Times New Roman" w:hAnsi="Times New Roman" w:eastAsia="Times New Roman"/>
+                <w:color w:val="000000"/>
+                <w:sz w:val="26"/>
+              </w:rPr>
               <w:t>Chọn bác sĩ Tran Binh</w:t>
             </w:r>
           </w:p>
@@ -1423,7 +2117,13 @@
             <w:tcW w:type="dxa" w:w="1440"/>
           </w:tcPr>
           <w:p>
-            <w:r/>
+            <w:r>
+              <w:rPr>
+                <w:rFonts w:ascii="Times New Roman" w:hAnsi="Times New Roman" w:eastAsia="Times New Roman"/>
+                <w:color w:val="000000"/>
+                <w:sz w:val="26"/>
+              </w:rPr>
+            </w:r>
           </w:p>
         </w:tc>
       </w:tr>
@@ -1434,6 +2134,11 @@
           </w:tcPr>
           <w:p>
             <w:r>
+              <w:rPr>
+                <w:rFonts w:ascii="Times New Roman" w:hAnsi="Times New Roman" w:eastAsia="Times New Roman"/>
+                <w:color w:val="000000"/>
+                <w:sz w:val="26"/>
+              </w:rPr>
               <w:t>TC-DOCTOR-004</w:t>
             </w:r>
           </w:p>
@@ -1444,6 +2149,11 @@
           </w:tcPr>
           <w:p>
             <w:r>
+              <w:rPr>
+                <w:rFonts w:ascii="Times New Roman" w:hAnsi="Times New Roman" w:eastAsia="Times New Roman"/>
+                <w:color w:val="000000"/>
+                <w:sz w:val="26"/>
+              </w:rPr>
               <w:t>3</w:t>
             </w:r>
           </w:p>
@@ -1454,6 +2164,11 @@
           </w:tcPr>
           <w:p>
             <w:r>
+              <w:rPr>
+                <w:rFonts w:ascii="Times New Roman" w:hAnsi="Times New Roman" w:eastAsia="Times New Roman"/>
+                <w:color w:val="000000"/>
+                <w:sz w:val="26"/>
+              </w:rPr>
               <w:t>PASS</w:t>
             </w:r>
           </w:p>
@@ -1464,7 +2179,12 @@
           </w:tcPr>
           <w:p>
             <w:r>
-              <w:t>30/08/2026 19:23:08</w:t>
+              <w:rPr>
+                <w:rFonts w:ascii="Times New Roman" w:hAnsi="Times New Roman" w:eastAsia="Times New Roman"/>
+                <w:color w:val="000000"/>
+                <w:sz w:val="26"/>
+              </w:rPr>
+              <w:t>06/09/2026 19:14:36</w:t>
             </w:r>
           </w:p>
         </w:tc>
@@ -1474,6 +2194,11 @@
           </w:tcPr>
           <w:p>
             <w:r>
+              <w:rPr>
+                <w:rFonts w:ascii="Times New Roman" w:hAnsi="Times New Roman" w:eastAsia="Times New Roman"/>
+                <w:color w:val="000000"/>
+                <w:sz w:val="26"/>
+              </w:rPr>
               <w:t>Nhấn Đặt lịch hẹn của bác sĩ Tran Binh</w:t>
             </w:r>
           </w:p>
@@ -1483,7 +2208,13 @@
             <w:tcW w:type="dxa" w:w="1440"/>
           </w:tcPr>
           <w:p>
-            <w:r/>
+            <w:r>
+              <w:rPr>
+                <w:rFonts w:ascii="Times New Roman" w:hAnsi="Times New Roman" w:eastAsia="Times New Roman"/>
+                <w:color w:val="000000"/>
+                <w:sz w:val="26"/>
+              </w:rPr>
+            </w:r>
           </w:p>
         </w:tc>
       </w:tr>
@@ -1494,6 +2225,11 @@
           </w:tcPr>
           <w:p>
             <w:r>
+              <w:rPr>
+                <w:rFonts w:ascii="Times New Roman" w:hAnsi="Times New Roman" w:eastAsia="Times New Roman"/>
+                <w:color w:val="000000"/>
+                <w:sz w:val="26"/>
+              </w:rPr>
               <w:t>TC-DOCTOR-004</w:t>
             </w:r>
           </w:p>
@@ -1504,6 +2240,11 @@
           </w:tcPr>
           <w:p>
             <w:r>
+              <w:rPr>
+                <w:rFonts w:ascii="Times New Roman" w:hAnsi="Times New Roman" w:eastAsia="Times New Roman"/>
+                <w:color w:val="000000"/>
+                <w:sz w:val="26"/>
+              </w:rPr>
               <w:t>4</w:t>
             </w:r>
           </w:p>
@@ -1514,6 +2255,11 @@
           </w:tcPr>
           <w:p>
             <w:r>
+              <w:rPr>
+                <w:rFonts w:ascii="Times New Roman" w:hAnsi="Times New Roman" w:eastAsia="Times New Roman"/>
+                <w:color w:val="000000"/>
+                <w:sz w:val="26"/>
+              </w:rPr>
               <w:t>PASS</w:t>
             </w:r>
           </w:p>
@@ -1524,7 +2270,12 @@
           </w:tcPr>
           <w:p>
             <w:r>
-              <w:t>30/08/2026 19:23:08</w:t>
+              <w:rPr>
+                <w:rFonts w:ascii="Times New Roman" w:hAnsi="Times New Roman" w:eastAsia="Times New Roman"/>
+                <w:color w:val="000000"/>
+                <w:sz w:val="26"/>
+              </w:rPr>
+              <w:t>06/09/2026 19:14:36</w:t>
             </w:r>
           </w:p>
         </w:tc>
@@ -1534,6 +2285,11 @@
           </w:tcPr>
           <w:p>
             <w:r>
+              <w:rPr>
+                <w:rFonts w:ascii="Times New Roman" w:hAnsi="Times New Roman" w:eastAsia="Times New Roman"/>
+                <w:color w:val="000000"/>
+                <w:sz w:val="26"/>
+              </w:rPr>
               <w:t>Hệ thống điều hướng đến trang Đặt lịch hẹn</w:t>
             </w:r>
           </w:p>
@@ -1544,6 +2300,11 @@
           </w:tcPr>
           <w:p>
             <w:r>
+              <w:rPr>
+                <w:rFonts w:ascii="Times New Roman" w:hAnsi="Times New Roman" w:eastAsia="Times New Roman"/>
+                <w:color w:val="000000"/>
+                <w:sz w:val="26"/>
+              </w:rPr>
               <w:t>URL: http://localhost:3000/booking?doctorId=1</w:t>
             </w:r>
           </w:p>
@@ -1556,6 +2317,11 @@
           </w:tcPr>
           <w:p>
             <w:r>
+              <w:rPr>
+                <w:rFonts w:ascii="Times New Roman" w:hAnsi="Times New Roman" w:eastAsia="Times New Roman"/>
+                <w:color w:val="000000"/>
+                <w:sz w:val="26"/>
+              </w:rPr>
               <w:t>TC-DOCTOR-004</w:t>
             </w:r>
           </w:p>
@@ -1566,6 +2332,11 @@
           </w:tcPr>
           <w:p>
             <w:r>
+              <w:rPr>
+                <w:rFonts w:ascii="Times New Roman" w:hAnsi="Times New Roman" w:eastAsia="Times New Roman"/>
+                <w:color w:val="000000"/>
+                <w:sz w:val="26"/>
+              </w:rPr>
               <w:t>5</w:t>
             </w:r>
           </w:p>
@@ -1576,6 +2347,11 @@
           </w:tcPr>
           <w:p>
             <w:r>
+              <w:rPr>
+                <w:rFonts w:ascii="Times New Roman" w:hAnsi="Times New Roman" w:eastAsia="Times New Roman"/>
+                <w:color w:val="000000"/>
+                <w:sz w:val="26"/>
+              </w:rPr>
               <w:t>PASS</w:t>
             </w:r>
           </w:p>
@@ -1586,7 +2362,12 @@
           </w:tcPr>
           <w:p>
             <w:r>
-              <w:t>30/08/2026 19:23:08</w:t>
+              <w:rPr>
+                <w:rFonts w:ascii="Times New Roman" w:hAnsi="Times New Roman" w:eastAsia="Times New Roman"/>
+                <w:color w:val="000000"/>
+                <w:sz w:val="26"/>
+              </w:rPr>
+              <w:t>06/09/2026 19:14:36</w:t>
             </w:r>
           </w:p>
         </w:tc>
@@ -1596,6 +2377,11 @@
           </w:tcPr>
           <w:p>
             <w:r>
+              <w:rPr>
+                <w:rFonts w:ascii="Times New Roman" w:hAnsi="Times New Roman" w:eastAsia="Times New Roman"/>
+                <w:color w:val="000000"/>
+                <w:sz w:val="26"/>
+              </w:rPr>
               <w:t>Trang Đặt lịch hiển thị đúng bác sĩ đã chọn</w:t>
             </w:r>
           </w:p>
@@ -1606,6 +2392,11 @@
           </w:tcPr>
           <w:p>
             <w:r>
+              <w:rPr>
+                <w:rFonts w:ascii="Times New Roman" w:hAnsi="Times New Roman" w:eastAsia="Times New Roman"/>
+                <w:color w:val="000000"/>
+                <w:sz w:val="26"/>
+              </w:rPr>
               <w:t>Expected: Tran Binh | Actual: Tran Binh</w:t>
             </w:r>
           </w:p>
@@ -1985,6 +2776,11 @@
     <w:name w:val="Normal"/>
     <w:qFormat/>
     <w:rsid w:val="00FC693F"/>
+    <w:rPr>
+      <w:rFonts w:ascii="Times New Roman" w:hAnsi="Times New Roman" w:eastAsia="Times New Roman"/>
+      <w:color w:val="000000"/>
+      <w:sz w:val="26"/>
+    </w:rPr>
   </w:style>
   <w:style w:type="paragraph" w:styleId="Header">
     <w:name w:val="header"/>

</xml_diff>